<commit_message>
Done report week 2
</commit_message>
<xml_diff>
--- a/week2/Report.docx
+++ b/week2/Report.docx
@@ -16,7 +16,14 @@
           <w:sz w:val="32"/>
           <w:szCs w:val="32"/>
         </w:rPr>
-        <w:t>Report tuần 1</w:t>
+        <w:t xml:space="preserve">Report tuần </w:t>
+      </w:r>
+      <w:r>
+        <w:rPr>
+          <w:sz w:val="32"/>
+          <w:szCs w:val="32"/>
+        </w:rPr>
+        <w:t>2</w:t>
       </w:r>
     </w:p>
     <w:p>
@@ -28,16 +35,80 @@
         </w:numPr>
       </w:pPr>
       <w:r>
-        <w:t>Khởi tạo docker compose</w:t>
+        <w:rPr>
+          <w:b/>
+          <w:bCs/>
+        </w:rPr>
+        <w:t>Singleton pattern</w:t>
+      </w:r>
+    </w:p>
+    <w:p>
+      <w:r>
+        <w:rPr>
+          <w:b/>
+          <w:bCs/>
+        </w:rPr>
+        <w:t>Khái niệm:</w:t>
+      </w:r>
+    </w:p>
+    <w:p>
+      <w:pPr>
+        <w:pStyle w:val="ListParagraph"/>
+        <w:numPr>
+          <w:ilvl w:val="0"/>
+          <w:numId w:val="6"/>
+        </w:numPr>
+      </w:pPr>
+      <w:r>
+        <w:t>Đảm bảo một class chỉ có 1 instance duy nhất trong toàn bộ ứng dụng</w:t>
+      </w:r>
+    </w:p>
+    <w:p>
+      <w:pPr>
+        <w:pStyle w:val="ListParagraph"/>
+        <w:numPr>
+          <w:ilvl w:val="0"/>
+          <w:numId w:val="6"/>
+        </w:numPr>
+      </w:pPr>
+      <w:r>
+        <w:t>Cung cấp global access point đến instance đó</w:t>
+      </w:r>
+    </w:p>
+    <w:p>
+      <w:pPr>
+        <w:rPr>
+          <w:b/>
+          <w:bCs/>
+        </w:rPr>
+      </w:pPr>
+      <w:r>
+        <w:rPr>
+          <w:b/>
+          <w:bCs/>
+        </w:rPr>
+        <w:t>Hoạt động:</w:t>
+      </w:r>
+    </w:p>
+    <w:p>
+      <w:pPr>
+        <w:pStyle w:val="ListParagraph"/>
+        <w:numPr>
+          <w:ilvl w:val="0"/>
+          <w:numId w:val="3"/>
+        </w:numPr>
+      </w:pPr>
+      <w:r>
+        <w:t>Trên giao diện:</w:t>
       </w:r>
     </w:p>
     <w:p>
       <w:r>
         <w:drawing>
-          <wp:inline distT="0" distB="0" distL="0" distR="0" wp14:anchorId="5A1C8D52" wp14:editId="26BB9AED">
+          <wp:inline distT="0" distB="0" distL="0" distR="0" wp14:anchorId="4D9FB81E" wp14:editId="698C660B">
             <wp:extent cx="5943600" cy="3713480"/>
             <wp:effectExtent l="0" t="0" r="0" b="1270"/>
-            <wp:docPr id="485164011" name="Picture 1"/>
+            <wp:docPr id="1176808089" name="Picture 1"/>
             <wp:cNvGraphicFramePr>
               <a:graphicFrameLocks xmlns:a="http://schemas.openxmlformats.org/drawingml/2006/main" noChangeAspect="1"/>
             </wp:cNvGraphicFramePr>
@@ -45,7 +116,7 @@
               <a:graphicData uri="http://schemas.openxmlformats.org/drawingml/2006/picture">
                 <pic:pic xmlns:pic="http://schemas.openxmlformats.org/drawingml/2006/picture">
                   <pic:nvPicPr>
-                    <pic:cNvPr id="485164011" name=""/>
+                    <pic:cNvPr id="1176808089" name=""/>
                     <pic:cNvPicPr/>
                   </pic:nvPicPr>
                   <pic:blipFill>
@@ -70,15 +141,26 @@
         </w:drawing>
       </w:r>
     </w:p>
-    <w:p/>
+    <w:p>
+      <w:pPr>
+        <w:pStyle w:val="ListParagraph"/>
+        <w:numPr>
+          <w:ilvl w:val="0"/>
+          <w:numId w:val="3"/>
+        </w:numPr>
+      </w:pPr>
+      <w:r>
+        <w:t>Tạo 2 instance trước</w:t>
+      </w:r>
+    </w:p>
     <w:p>
       <w:r>
         <w:lastRenderedPageBreak/>
         <w:drawing>
-          <wp:inline distT="0" distB="0" distL="0" distR="0" wp14:anchorId="1086DA53" wp14:editId="1D6EFAE5">
+          <wp:inline distT="0" distB="0" distL="0" distR="0" wp14:anchorId="4955D55C" wp14:editId="7ED82099">
             <wp:extent cx="5943600" cy="3713480"/>
             <wp:effectExtent l="0" t="0" r="0" b="1270"/>
-            <wp:docPr id="1091349191" name="Picture 1"/>
+            <wp:docPr id="99215338" name="Picture 1"/>
             <wp:cNvGraphicFramePr>
               <a:graphicFrameLocks xmlns:a="http://schemas.openxmlformats.org/drawingml/2006/main" noChangeAspect="1"/>
             </wp:cNvGraphicFramePr>
@@ -86,7 +168,7 @@
               <a:graphicData uri="http://schemas.openxmlformats.org/drawingml/2006/picture">
                 <pic:pic xmlns:pic="http://schemas.openxmlformats.org/drawingml/2006/picture">
                   <pic:nvPicPr>
-                    <pic:cNvPr id="1091349191" name=""/>
+                    <pic:cNvPr id="99215338" name=""/>
                     <pic:cNvPicPr/>
                   </pic:nvPicPr>
                   <pic:blipFill>
@@ -111,51 +193,25 @@
         </w:drawing>
       </w:r>
     </w:p>
-    <w:p/>
     <w:p>
       <w:pPr>
         <w:pStyle w:val="ListParagraph"/>
         <w:numPr>
           <w:ilvl w:val="0"/>
-          <w:numId w:val="1"/>
+          <w:numId w:val="3"/>
         </w:numPr>
       </w:pPr>
-      <w:bookmarkStart w:id="0" w:name="_Toc219918895"/>
-      <w:r>
-        <w:t xml:space="preserve">Truy cập </w:t>
-      </w:r>
-      <w:hyperlink r:id="rId7" w:anchor="/" w:history="1">
-        <w:r>
-          <w:rPr>
-            <w:rStyle w:val="Hyperlink"/>
-          </w:rPr>
-          <w:t>http://localhost:1</w:t>
-        </w:r>
-        <w:r>
-          <w:rPr>
-            <w:rStyle w:val="Hyperlink"/>
-          </w:rPr>
-          <w:t>5</w:t>
-        </w:r>
-        <w:r>
-          <w:rPr>
-            <w:rStyle w:val="Hyperlink"/>
-          </w:rPr>
-          <w:t>672/#/</w:t>
-        </w:r>
-      </w:hyperlink>
-      <w:r>
-        <w:t xml:space="preserve"> để thao tác với giao diện RabbitMQ</w:t>
-      </w:r>
-      <w:bookmarkEnd w:id="0"/>
+      <w:r>
+        <w:t>So sánh 2 db1 và db2 thì thấy id instance của cả 2 đều giống nhau. Cho thấy chúng sử dụng chung 1 instance chứ không hề tạo một instance mới.</w:t>
+      </w:r>
     </w:p>
     <w:p>
       <w:r>
         <w:drawing>
-          <wp:inline distT="0" distB="0" distL="0" distR="0" wp14:anchorId="35227616" wp14:editId="43A1E983">
+          <wp:inline distT="0" distB="0" distL="0" distR="0" wp14:anchorId="72FD908C" wp14:editId="2243EC4A">
             <wp:extent cx="5943600" cy="3713480"/>
             <wp:effectExtent l="0" t="0" r="0" b="1270"/>
-            <wp:docPr id="1130050121" name="Picture 1"/>
+            <wp:docPr id="738767598" name="Picture 1"/>
             <wp:cNvGraphicFramePr>
               <a:graphicFrameLocks xmlns:a="http://schemas.openxmlformats.org/drawingml/2006/main" noChangeAspect="1"/>
             </wp:cNvGraphicFramePr>
@@ -163,11 +219,11 @@
               <a:graphicData uri="http://schemas.openxmlformats.org/drawingml/2006/picture">
                 <pic:pic xmlns:pic="http://schemas.openxmlformats.org/drawingml/2006/picture">
                   <pic:nvPicPr>
-                    <pic:cNvPr id="1130050121" name=""/>
+                    <pic:cNvPr id="738767598" name=""/>
                     <pic:cNvPicPr/>
                   </pic:nvPicPr>
                   <pic:blipFill>
-                    <a:blip r:embed="rId8"/>
+                    <a:blip r:embed="rId7"/>
                     <a:stretch>
                       <a:fillRect/>
                     </a:stretch>
@@ -190,24 +246,27 @@
     </w:p>
     <w:p>
       <w:pPr>
-        <w:pStyle w:val="ListParagraph"/>
-        <w:numPr>
-          <w:ilvl w:val="0"/>
-          <w:numId w:val="1"/>
-        </w:numPr>
-      </w:pPr>
-      <w:r>
+        <w:rPr>
+          <w:b/>
+          <w:bCs/>
+        </w:rPr>
+      </w:pPr>
+      <w:r>
+        <w:rPr>
+          <w:b/>
+          <w:bCs/>
+        </w:rPr>
         <w:lastRenderedPageBreak/>
-        <w:t>Gửi request tới RabbitMQ Service</w:t>
+        <w:t>Logic code:</w:t>
       </w:r>
     </w:p>
     <w:p>
       <w:r>
         <w:drawing>
-          <wp:inline distT="0" distB="0" distL="0" distR="0" wp14:anchorId="04452850" wp14:editId="796EE9A9">
-            <wp:extent cx="5943600" cy="3713480"/>
-            <wp:effectExtent l="0" t="0" r="0" b="1270"/>
-            <wp:docPr id="1756324905" name="Picture 1"/>
+          <wp:inline distT="0" distB="0" distL="0" distR="0" wp14:anchorId="62C7C780" wp14:editId="44C90CF2">
+            <wp:extent cx="5943600" cy="4612640"/>
+            <wp:effectExtent l="0" t="0" r="0" b="0"/>
+            <wp:docPr id="1459477654" name="Picture 1"/>
             <wp:cNvGraphicFramePr>
               <a:graphicFrameLocks xmlns:a="http://schemas.openxmlformats.org/drawingml/2006/main" noChangeAspect="1"/>
             </wp:cNvGraphicFramePr>
@@ -215,7 +274,141 @@
               <a:graphicData uri="http://schemas.openxmlformats.org/drawingml/2006/picture">
                 <pic:pic xmlns:pic="http://schemas.openxmlformats.org/drawingml/2006/picture">
                   <pic:nvPicPr>
-                    <pic:cNvPr id="1756324905" name=""/>
+                    <pic:cNvPr id="1459477654" name=""/>
+                    <pic:cNvPicPr/>
+                  </pic:nvPicPr>
+                  <pic:blipFill>
+                    <a:blip r:embed="rId8"/>
+                    <a:stretch>
+                      <a:fillRect/>
+                    </a:stretch>
+                  </pic:blipFill>
+                  <pic:spPr>
+                    <a:xfrm>
+                      <a:off x="0" y="0"/>
+                      <a:ext cx="5943600" cy="4612640"/>
+                    </a:xfrm>
+                    <a:prstGeom prst="rect">
+                      <a:avLst/>
+                    </a:prstGeom>
+                  </pic:spPr>
+                </pic:pic>
+              </a:graphicData>
+            </a:graphic>
+          </wp:inline>
+        </w:drawing>
+      </w:r>
+    </w:p>
+    <w:p>
+      <w:r>
+        <w:br w:type="page"/>
+      </w:r>
+    </w:p>
+    <w:p>
+      <w:pPr>
+        <w:pStyle w:val="ListParagraph"/>
+        <w:numPr>
+          <w:ilvl w:val="0"/>
+          <w:numId w:val="1"/>
+        </w:numPr>
+      </w:pPr>
+      <w:r>
+        <w:rPr>
+          <w:b/>
+          <w:bCs/>
+        </w:rPr>
+        <w:lastRenderedPageBreak/>
+        <w:t xml:space="preserve">Factory </w:t>
+      </w:r>
+      <w:r>
+        <w:rPr>
+          <w:b/>
+          <w:bCs/>
+        </w:rPr>
+        <w:t>pattern</w:t>
+      </w:r>
+    </w:p>
+    <w:p>
+      <w:pPr>
+        <w:rPr>
+          <w:b/>
+          <w:bCs/>
+        </w:rPr>
+      </w:pPr>
+      <w:r>
+        <w:rPr>
+          <w:b/>
+          <w:bCs/>
+        </w:rPr>
+        <w:t>Khái niệm:</w:t>
+      </w:r>
+    </w:p>
+    <w:p>
+      <w:pPr>
+        <w:pStyle w:val="ListParagraph"/>
+        <w:numPr>
+          <w:ilvl w:val="0"/>
+          <w:numId w:val="3"/>
+        </w:numPr>
+      </w:pPr>
+      <w:r>
+        <w:t>Tạo objects mà không cần biết class cụ thể</w:t>
+      </w:r>
+    </w:p>
+    <w:p>
+      <w:pPr>
+        <w:pStyle w:val="ListParagraph"/>
+        <w:numPr>
+          <w:ilvl w:val="0"/>
+          <w:numId w:val="3"/>
+        </w:numPr>
+      </w:pPr>
+      <w:r>
+        <w:t>Factory quyết định tạo object nào dựa trên type</w:t>
+      </w:r>
+    </w:p>
+    <w:p>
+      <w:pPr>
+        <w:pStyle w:val="ListParagraph"/>
+        <w:numPr>
+          <w:ilvl w:val="0"/>
+          <w:numId w:val="3"/>
+        </w:numPr>
+      </w:pPr>
+      <w:r>
+        <w:t>Client code chỉ làm việc với interface/abstract class, không biết concrete class</w:t>
+      </w:r>
+    </w:p>
+    <w:p>
+      <w:pPr>
+        <w:rPr>
+          <w:b/>
+          <w:bCs/>
+        </w:rPr>
+      </w:pPr>
+      <w:r>
+        <w:rPr>
+          <w:b/>
+          <w:bCs/>
+        </w:rPr>
+        <w:t>Hoạt động:</w:t>
+      </w:r>
+    </w:p>
+    <w:p>
+      <w:r>
+        <w:drawing>
+          <wp:inline distT="0" distB="0" distL="0" distR="0" wp14:anchorId="732AF17C" wp14:editId="20AFF7AD">
+            <wp:extent cx="5943600" cy="3713480"/>
+            <wp:effectExtent l="0" t="0" r="0" b="1270"/>
+            <wp:docPr id="319275899" name="Picture 1"/>
+            <wp:cNvGraphicFramePr>
+              <a:graphicFrameLocks xmlns:a="http://schemas.openxmlformats.org/drawingml/2006/main" noChangeAspect="1"/>
+            </wp:cNvGraphicFramePr>
+            <a:graphic xmlns:a="http://schemas.openxmlformats.org/drawingml/2006/main">
+              <a:graphicData uri="http://schemas.openxmlformats.org/drawingml/2006/picture">
+                <pic:pic xmlns:pic="http://schemas.openxmlformats.org/drawingml/2006/picture">
+                  <pic:nvPicPr>
+                    <pic:cNvPr id="319275899" name=""/>
                     <pic:cNvPicPr/>
                   </pic:nvPicPr>
                   <pic:blipFill>
@@ -240,6 +433,215 @@
         </w:drawing>
       </w:r>
     </w:p>
+    <w:p>
+      <w:r>
+        <w:lastRenderedPageBreak/>
+        <w:drawing>
+          <wp:inline distT="0" distB="0" distL="0" distR="0" wp14:anchorId="25BF145F" wp14:editId="2198D983">
+            <wp:extent cx="5943600" cy="3713480"/>
+            <wp:effectExtent l="0" t="0" r="0" b="1270"/>
+            <wp:docPr id="1111331064" name="Picture 1"/>
+            <wp:cNvGraphicFramePr>
+              <a:graphicFrameLocks xmlns:a="http://schemas.openxmlformats.org/drawingml/2006/main" noChangeAspect="1"/>
+            </wp:cNvGraphicFramePr>
+            <a:graphic xmlns:a="http://schemas.openxmlformats.org/drawingml/2006/main">
+              <a:graphicData uri="http://schemas.openxmlformats.org/drawingml/2006/picture">
+                <pic:pic xmlns:pic="http://schemas.openxmlformats.org/drawingml/2006/picture">
+                  <pic:nvPicPr>
+                    <pic:cNvPr id="1111331064" name=""/>
+                    <pic:cNvPicPr/>
+                  </pic:nvPicPr>
+                  <pic:blipFill>
+                    <a:blip r:embed="rId10"/>
+                    <a:stretch>
+                      <a:fillRect/>
+                    </a:stretch>
+                  </pic:blipFill>
+                  <pic:spPr>
+                    <a:xfrm>
+                      <a:off x="0" y="0"/>
+                      <a:ext cx="5943600" cy="3713480"/>
+                    </a:xfrm>
+                    <a:prstGeom prst="rect">
+                      <a:avLst/>
+                    </a:prstGeom>
+                  </pic:spPr>
+                </pic:pic>
+              </a:graphicData>
+            </a:graphic>
+          </wp:inline>
+        </w:drawing>
+      </w:r>
+    </w:p>
+    <w:p>
+      <w:r>
+        <w:rPr>
+          <w:b/>
+          <w:bCs/>
+        </w:rPr>
+        <w:t>Vấn đề:</w:t>
+      </w:r>
+    </w:p>
+    <w:p>
+      <w:pPr>
+        <w:pStyle w:val="ListParagraph"/>
+        <w:numPr>
+          <w:ilvl w:val="0"/>
+          <w:numId w:val="3"/>
+        </w:numPr>
+      </w:pPr>
+      <w:r>
+        <w:t>Có nhiều loại sản phẩm: Electronics, Clothing, Food</w:t>
+      </w:r>
+    </w:p>
+    <w:p>
+      <w:pPr>
+        <w:pStyle w:val="ListParagraph"/>
+        <w:numPr>
+          <w:ilvl w:val="0"/>
+          <w:numId w:val="3"/>
+        </w:numPr>
+      </w:pPr>
+      <w:r>
+        <w:t>Mỗi loại có thuộc tính riêng (Electronics có warranty, Clothing có size, Food có expiry)</w:t>
+      </w:r>
+    </w:p>
+    <w:p>
+      <w:pPr>
+        <w:pStyle w:val="ListParagraph"/>
+        <w:numPr>
+          <w:ilvl w:val="0"/>
+          <w:numId w:val="3"/>
+        </w:numPr>
+      </w:pPr>
+      <w:r>
+        <w:t>Client không muốn viết: `if (type === 'electronics') { return new Electronics(...) }`</w:t>
+      </w:r>
+    </w:p>
+    <w:p>
+      <w:r>
+        <w:rPr>
+          <w:b/>
+          <w:bCs/>
+        </w:rPr>
+        <w:t>Giải pháp:</w:t>
+      </w:r>
+    </w:p>
+    <w:p>
+      <w:pPr>
+        <w:pStyle w:val="ListParagraph"/>
+        <w:numPr>
+          <w:ilvl w:val="0"/>
+          <w:numId w:val="3"/>
+        </w:numPr>
+      </w:pPr>
+      <w:r>
+        <w:t>Factory nhận `type` và tự động tạo đúng class</w:t>
+      </w:r>
+    </w:p>
+    <w:p>
+      <w:pPr>
+        <w:pStyle w:val="ListParagraph"/>
+        <w:numPr>
+          <w:ilvl w:val="0"/>
+          <w:numId w:val="3"/>
+        </w:numPr>
+      </w:pPr>
+      <w:r>
+        <w:t>Client chỉ cần: `ProductFactory.createProduct(type, name, price, extra)`</w:t>
+      </w:r>
+    </w:p>
+    <w:p>
+      <w:pPr>
+        <w:pStyle w:val="ListParagraph"/>
+        <w:numPr>
+          <w:ilvl w:val="0"/>
+          <w:numId w:val="3"/>
+        </w:numPr>
+      </w:pPr>
+      <w:r>
+        <w:t>Thêm loại mới? Chỉ sửa Factory, không động đến client code</w:t>
+      </w:r>
+    </w:p>
+    <w:p>
+      <w:r>
+        <w:drawing>
+          <wp:inline distT="0" distB="0" distL="0" distR="0" wp14:anchorId="5310BD13" wp14:editId="6DE48F5F">
+            <wp:extent cx="5943600" cy="1579245"/>
+            <wp:effectExtent l="0" t="0" r="0" b="1905"/>
+            <wp:docPr id="1161743703" name="Picture 1"/>
+            <wp:cNvGraphicFramePr>
+              <a:graphicFrameLocks xmlns:a="http://schemas.openxmlformats.org/drawingml/2006/main" noChangeAspect="1"/>
+            </wp:cNvGraphicFramePr>
+            <a:graphic xmlns:a="http://schemas.openxmlformats.org/drawingml/2006/main">
+              <a:graphicData uri="http://schemas.openxmlformats.org/drawingml/2006/picture">
+                <pic:pic xmlns:pic="http://schemas.openxmlformats.org/drawingml/2006/picture">
+                  <pic:nvPicPr>
+                    <pic:cNvPr id="1161743703" name=""/>
+                    <pic:cNvPicPr/>
+                  </pic:nvPicPr>
+                  <pic:blipFill>
+                    <a:blip r:embed="rId11"/>
+                    <a:stretch>
+                      <a:fillRect/>
+                    </a:stretch>
+                  </pic:blipFill>
+                  <pic:spPr>
+                    <a:xfrm>
+                      <a:off x="0" y="0"/>
+                      <a:ext cx="5943600" cy="1579245"/>
+                    </a:xfrm>
+                    <a:prstGeom prst="rect">
+                      <a:avLst/>
+                    </a:prstGeom>
+                  </pic:spPr>
+                </pic:pic>
+              </a:graphicData>
+            </a:graphic>
+          </wp:inline>
+        </w:drawing>
+      </w:r>
+    </w:p>
+    <w:p>
+      <w:r>
+        <w:lastRenderedPageBreak/>
+        <w:drawing>
+          <wp:inline distT="0" distB="0" distL="0" distR="0" wp14:anchorId="0AEC9D0E" wp14:editId="1CF23011">
+            <wp:extent cx="5943600" cy="2026920"/>
+            <wp:effectExtent l="0" t="0" r="0" b="0"/>
+            <wp:docPr id="146620427" name="Picture 1"/>
+            <wp:cNvGraphicFramePr>
+              <a:graphicFrameLocks xmlns:a="http://schemas.openxmlformats.org/drawingml/2006/main" noChangeAspect="1"/>
+            </wp:cNvGraphicFramePr>
+            <a:graphic xmlns:a="http://schemas.openxmlformats.org/drawingml/2006/main">
+              <a:graphicData uri="http://schemas.openxmlformats.org/drawingml/2006/picture">
+                <pic:pic xmlns:pic="http://schemas.openxmlformats.org/drawingml/2006/picture">
+                  <pic:nvPicPr>
+                    <pic:cNvPr id="146620427" name=""/>
+                    <pic:cNvPicPr/>
+                  </pic:nvPicPr>
+                  <pic:blipFill>
+                    <a:blip r:embed="rId12"/>
+                    <a:stretch>
+                      <a:fillRect/>
+                    </a:stretch>
+                  </pic:blipFill>
+                  <pic:spPr>
+                    <a:xfrm>
+                      <a:off x="0" y="0"/>
+                      <a:ext cx="5943600" cy="2026920"/>
+                    </a:xfrm>
+                    <a:prstGeom prst="rect">
+                      <a:avLst/>
+                    </a:prstGeom>
+                  </pic:spPr>
+                </pic:pic>
+              </a:graphicData>
+            </a:graphic>
+          </wp:inline>
+        </w:drawing>
+      </w:r>
+    </w:p>
     <w:sectPr>
       <w:pgSz w:w="12240" w:h="15840"/>
       <w:pgMar w:top="1440" w:right="1440" w:bottom="1440" w:left="1440" w:header="720" w:footer="720" w:gutter="0"/>
@@ -339,6 +741,655 @@
     </w:lvl>
   </w:abstractNum>
   <w:abstractNum w:abstractNumId="1" w15:restartNumberingAfterBreak="0">
+    <w:nsid w:val="348E728A"/>
+    <w:multiLevelType w:val="hybridMultilevel"/>
+    <w:tmpl w:val="F998CBAC"/>
+    <w:lvl w:ilvl="0" w:tplc="0E620C60">
+      <w:numFmt w:val="bullet"/>
+      <w:lvlText w:val="-"/>
+      <w:lvlJc w:val="left"/>
+      <w:pPr>
+        <w:ind w:left="720" w:hanging="360"/>
+      </w:pPr>
+      <w:rPr>
+        <w:rFonts w:ascii="Aptos" w:eastAsiaTheme="minorHAnsi" w:hAnsi="Aptos" w:cstheme="minorBidi" w:hint="default"/>
+      </w:rPr>
+    </w:lvl>
+    <w:lvl w:ilvl="1" w:tplc="04090003" w:tentative="1">
+      <w:start w:val="1"/>
+      <w:numFmt w:val="bullet"/>
+      <w:lvlText w:val="o"/>
+      <w:lvlJc w:val="left"/>
+      <w:pPr>
+        <w:ind w:left="1440" w:hanging="360"/>
+      </w:pPr>
+      <w:rPr>
+        <w:rFonts w:ascii="Courier New" w:hAnsi="Courier New" w:cs="Courier New" w:hint="default"/>
+      </w:rPr>
+    </w:lvl>
+    <w:lvl w:ilvl="2" w:tplc="04090005" w:tentative="1">
+      <w:start w:val="1"/>
+      <w:numFmt w:val="bullet"/>
+      <w:lvlText w:val=""/>
+      <w:lvlJc w:val="left"/>
+      <w:pPr>
+        <w:ind w:left="2160" w:hanging="360"/>
+      </w:pPr>
+      <w:rPr>
+        <w:rFonts w:ascii="Wingdings" w:hAnsi="Wingdings" w:hint="default"/>
+      </w:rPr>
+    </w:lvl>
+    <w:lvl w:ilvl="3" w:tplc="04090001" w:tentative="1">
+      <w:start w:val="1"/>
+      <w:numFmt w:val="bullet"/>
+      <w:lvlText w:val=""/>
+      <w:lvlJc w:val="left"/>
+      <w:pPr>
+        <w:ind w:left="2880" w:hanging="360"/>
+      </w:pPr>
+      <w:rPr>
+        <w:rFonts w:ascii="Symbol" w:hAnsi="Symbol" w:hint="default"/>
+      </w:rPr>
+    </w:lvl>
+    <w:lvl w:ilvl="4" w:tplc="04090003" w:tentative="1">
+      <w:start w:val="1"/>
+      <w:numFmt w:val="bullet"/>
+      <w:lvlText w:val="o"/>
+      <w:lvlJc w:val="left"/>
+      <w:pPr>
+        <w:ind w:left="3600" w:hanging="360"/>
+      </w:pPr>
+      <w:rPr>
+        <w:rFonts w:ascii="Courier New" w:hAnsi="Courier New" w:cs="Courier New" w:hint="default"/>
+      </w:rPr>
+    </w:lvl>
+    <w:lvl w:ilvl="5" w:tplc="04090005" w:tentative="1">
+      <w:start w:val="1"/>
+      <w:numFmt w:val="bullet"/>
+      <w:lvlText w:val=""/>
+      <w:lvlJc w:val="left"/>
+      <w:pPr>
+        <w:ind w:left="4320" w:hanging="360"/>
+      </w:pPr>
+      <w:rPr>
+        <w:rFonts w:ascii="Wingdings" w:hAnsi="Wingdings" w:hint="default"/>
+      </w:rPr>
+    </w:lvl>
+    <w:lvl w:ilvl="6" w:tplc="04090001" w:tentative="1">
+      <w:start w:val="1"/>
+      <w:numFmt w:val="bullet"/>
+      <w:lvlText w:val=""/>
+      <w:lvlJc w:val="left"/>
+      <w:pPr>
+        <w:ind w:left="5040" w:hanging="360"/>
+      </w:pPr>
+      <w:rPr>
+        <w:rFonts w:ascii="Symbol" w:hAnsi="Symbol" w:hint="default"/>
+      </w:rPr>
+    </w:lvl>
+    <w:lvl w:ilvl="7" w:tplc="04090003" w:tentative="1">
+      <w:start w:val="1"/>
+      <w:numFmt w:val="bullet"/>
+      <w:lvlText w:val="o"/>
+      <w:lvlJc w:val="left"/>
+      <w:pPr>
+        <w:ind w:left="5760" w:hanging="360"/>
+      </w:pPr>
+      <w:rPr>
+        <w:rFonts w:ascii="Courier New" w:hAnsi="Courier New" w:cs="Courier New" w:hint="default"/>
+      </w:rPr>
+    </w:lvl>
+    <w:lvl w:ilvl="8" w:tplc="04090005" w:tentative="1">
+      <w:start w:val="1"/>
+      <w:numFmt w:val="bullet"/>
+      <w:lvlText w:val=""/>
+      <w:lvlJc w:val="left"/>
+      <w:pPr>
+        <w:ind w:left="6480" w:hanging="360"/>
+      </w:pPr>
+      <w:rPr>
+        <w:rFonts w:ascii="Wingdings" w:hAnsi="Wingdings" w:hint="default"/>
+      </w:rPr>
+    </w:lvl>
+  </w:abstractNum>
+  <w:abstractNum w:abstractNumId="2" w15:restartNumberingAfterBreak="0">
+    <w:nsid w:val="39FB0824"/>
+    <w:multiLevelType w:val="hybridMultilevel"/>
+    <w:tmpl w:val="E3DC2C82"/>
+    <w:lvl w:ilvl="0" w:tplc="0E620C60">
+      <w:numFmt w:val="bullet"/>
+      <w:lvlText w:val="-"/>
+      <w:lvlJc w:val="left"/>
+      <w:pPr>
+        <w:ind w:left="720" w:hanging="360"/>
+      </w:pPr>
+      <w:rPr>
+        <w:rFonts w:ascii="Aptos" w:eastAsiaTheme="minorHAnsi" w:hAnsi="Aptos" w:cstheme="minorBidi" w:hint="default"/>
+      </w:rPr>
+    </w:lvl>
+    <w:lvl w:ilvl="1" w:tplc="04090003" w:tentative="1">
+      <w:start w:val="1"/>
+      <w:numFmt w:val="bullet"/>
+      <w:lvlText w:val="o"/>
+      <w:lvlJc w:val="left"/>
+      <w:pPr>
+        <w:ind w:left="1440" w:hanging="360"/>
+      </w:pPr>
+      <w:rPr>
+        <w:rFonts w:ascii="Courier New" w:hAnsi="Courier New" w:cs="Courier New" w:hint="default"/>
+      </w:rPr>
+    </w:lvl>
+    <w:lvl w:ilvl="2" w:tplc="04090005" w:tentative="1">
+      <w:start w:val="1"/>
+      <w:numFmt w:val="bullet"/>
+      <w:lvlText w:val=""/>
+      <w:lvlJc w:val="left"/>
+      <w:pPr>
+        <w:ind w:left="2160" w:hanging="360"/>
+      </w:pPr>
+      <w:rPr>
+        <w:rFonts w:ascii="Wingdings" w:hAnsi="Wingdings" w:hint="default"/>
+      </w:rPr>
+    </w:lvl>
+    <w:lvl w:ilvl="3" w:tplc="04090001" w:tentative="1">
+      <w:start w:val="1"/>
+      <w:numFmt w:val="bullet"/>
+      <w:lvlText w:val=""/>
+      <w:lvlJc w:val="left"/>
+      <w:pPr>
+        <w:ind w:left="2880" w:hanging="360"/>
+      </w:pPr>
+      <w:rPr>
+        <w:rFonts w:ascii="Symbol" w:hAnsi="Symbol" w:hint="default"/>
+      </w:rPr>
+    </w:lvl>
+    <w:lvl w:ilvl="4" w:tplc="04090003" w:tentative="1">
+      <w:start w:val="1"/>
+      <w:numFmt w:val="bullet"/>
+      <w:lvlText w:val="o"/>
+      <w:lvlJc w:val="left"/>
+      <w:pPr>
+        <w:ind w:left="3600" w:hanging="360"/>
+      </w:pPr>
+      <w:rPr>
+        <w:rFonts w:ascii="Courier New" w:hAnsi="Courier New" w:cs="Courier New" w:hint="default"/>
+      </w:rPr>
+    </w:lvl>
+    <w:lvl w:ilvl="5" w:tplc="04090005" w:tentative="1">
+      <w:start w:val="1"/>
+      <w:numFmt w:val="bullet"/>
+      <w:lvlText w:val=""/>
+      <w:lvlJc w:val="left"/>
+      <w:pPr>
+        <w:ind w:left="4320" w:hanging="360"/>
+      </w:pPr>
+      <w:rPr>
+        <w:rFonts w:ascii="Wingdings" w:hAnsi="Wingdings" w:hint="default"/>
+      </w:rPr>
+    </w:lvl>
+    <w:lvl w:ilvl="6" w:tplc="04090001" w:tentative="1">
+      <w:start w:val="1"/>
+      <w:numFmt w:val="bullet"/>
+      <w:lvlText w:val=""/>
+      <w:lvlJc w:val="left"/>
+      <w:pPr>
+        <w:ind w:left="5040" w:hanging="360"/>
+      </w:pPr>
+      <w:rPr>
+        <w:rFonts w:ascii="Symbol" w:hAnsi="Symbol" w:hint="default"/>
+      </w:rPr>
+    </w:lvl>
+    <w:lvl w:ilvl="7" w:tplc="04090003" w:tentative="1">
+      <w:start w:val="1"/>
+      <w:numFmt w:val="bullet"/>
+      <w:lvlText w:val="o"/>
+      <w:lvlJc w:val="left"/>
+      <w:pPr>
+        <w:ind w:left="5760" w:hanging="360"/>
+      </w:pPr>
+      <w:rPr>
+        <w:rFonts w:ascii="Courier New" w:hAnsi="Courier New" w:cs="Courier New" w:hint="default"/>
+      </w:rPr>
+    </w:lvl>
+    <w:lvl w:ilvl="8" w:tplc="04090005" w:tentative="1">
+      <w:start w:val="1"/>
+      <w:numFmt w:val="bullet"/>
+      <w:lvlText w:val=""/>
+      <w:lvlJc w:val="left"/>
+      <w:pPr>
+        <w:ind w:left="6480" w:hanging="360"/>
+      </w:pPr>
+      <w:rPr>
+        <w:rFonts w:ascii="Wingdings" w:hAnsi="Wingdings" w:hint="default"/>
+      </w:rPr>
+    </w:lvl>
+  </w:abstractNum>
+  <w:abstractNum w:abstractNumId="3" w15:restartNumberingAfterBreak="0">
+    <w:nsid w:val="45E76BC7"/>
+    <w:multiLevelType w:val="hybridMultilevel"/>
+    <w:tmpl w:val="223A569A"/>
+    <w:lvl w:ilvl="0" w:tplc="0E620C60">
+      <w:numFmt w:val="bullet"/>
+      <w:lvlText w:val="-"/>
+      <w:lvlJc w:val="left"/>
+      <w:pPr>
+        <w:ind w:left="720" w:hanging="360"/>
+      </w:pPr>
+      <w:rPr>
+        <w:rFonts w:ascii="Aptos" w:eastAsiaTheme="minorHAnsi" w:hAnsi="Aptos" w:cstheme="minorBidi" w:hint="default"/>
+      </w:rPr>
+    </w:lvl>
+    <w:lvl w:ilvl="1" w:tplc="04090003" w:tentative="1">
+      <w:start w:val="1"/>
+      <w:numFmt w:val="bullet"/>
+      <w:lvlText w:val="o"/>
+      <w:lvlJc w:val="left"/>
+      <w:pPr>
+        <w:ind w:left="1440" w:hanging="360"/>
+      </w:pPr>
+      <w:rPr>
+        <w:rFonts w:ascii="Courier New" w:hAnsi="Courier New" w:cs="Courier New" w:hint="default"/>
+      </w:rPr>
+    </w:lvl>
+    <w:lvl w:ilvl="2" w:tplc="04090005" w:tentative="1">
+      <w:start w:val="1"/>
+      <w:numFmt w:val="bullet"/>
+      <w:lvlText w:val=""/>
+      <w:lvlJc w:val="left"/>
+      <w:pPr>
+        <w:ind w:left="2160" w:hanging="360"/>
+      </w:pPr>
+      <w:rPr>
+        <w:rFonts w:ascii="Wingdings" w:hAnsi="Wingdings" w:hint="default"/>
+      </w:rPr>
+    </w:lvl>
+    <w:lvl w:ilvl="3" w:tplc="04090001" w:tentative="1">
+      <w:start w:val="1"/>
+      <w:numFmt w:val="bullet"/>
+      <w:lvlText w:val=""/>
+      <w:lvlJc w:val="left"/>
+      <w:pPr>
+        <w:ind w:left="2880" w:hanging="360"/>
+      </w:pPr>
+      <w:rPr>
+        <w:rFonts w:ascii="Symbol" w:hAnsi="Symbol" w:hint="default"/>
+      </w:rPr>
+    </w:lvl>
+    <w:lvl w:ilvl="4" w:tplc="04090003" w:tentative="1">
+      <w:start w:val="1"/>
+      <w:numFmt w:val="bullet"/>
+      <w:lvlText w:val="o"/>
+      <w:lvlJc w:val="left"/>
+      <w:pPr>
+        <w:ind w:left="3600" w:hanging="360"/>
+      </w:pPr>
+      <w:rPr>
+        <w:rFonts w:ascii="Courier New" w:hAnsi="Courier New" w:cs="Courier New" w:hint="default"/>
+      </w:rPr>
+    </w:lvl>
+    <w:lvl w:ilvl="5" w:tplc="04090005" w:tentative="1">
+      <w:start w:val="1"/>
+      <w:numFmt w:val="bullet"/>
+      <w:lvlText w:val=""/>
+      <w:lvlJc w:val="left"/>
+      <w:pPr>
+        <w:ind w:left="4320" w:hanging="360"/>
+      </w:pPr>
+      <w:rPr>
+        <w:rFonts w:ascii="Wingdings" w:hAnsi="Wingdings" w:hint="default"/>
+      </w:rPr>
+    </w:lvl>
+    <w:lvl w:ilvl="6" w:tplc="04090001" w:tentative="1">
+      <w:start w:val="1"/>
+      <w:numFmt w:val="bullet"/>
+      <w:lvlText w:val=""/>
+      <w:lvlJc w:val="left"/>
+      <w:pPr>
+        <w:ind w:left="5040" w:hanging="360"/>
+      </w:pPr>
+      <w:rPr>
+        <w:rFonts w:ascii="Symbol" w:hAnsi="Symbol" w:hint="default"/>
+      </w:rPr>
+    </w:lvl>
+    <w:lvl w:ilvl="7" w:tplc="04090003" w:tentative="1">
+      <w:start w:val="1"/>
+      <w:numFmt w:val="bullet"/>
+      <w:lvlText w:val="o"/>
+      <w:lvlJc w:val="left"/>
+      <w:pPr>
+        <w:ind w:left="5760" w:hanging="360"/>
+      </w:pPr>
+      <w:rPr>
+        <w:rFonts w:ascii="Courier New" w:hAnsi="Courier New" w:cs="Courier New" w:hint="default"/>
+      </w:rPr>
+    </w:lvl>
+    <w:lvl w:ilvl="8" w:tplc="04090005" w:tentative="1">
+      <w:start w:val="1"/>
+      <w:numFmt w:val="bullet"/>
+      <w:lvlText w:val=""/>
+      <w:lvlJc w:val="left"/>
+      <w:pPr>
+        <w:ind w:left="6480" w:hanging="360"/>
+      </w:pPr>
+      <w:rPr>
+        <w:rFonts w:ascii="Wingdings" w:hAnsi="Wingdings" w:hint="default"/>
+      </w:rPr>
+    </w:lvl>
+  </w:abstractNum>
+  <w:abstractNum w:abstractNumId="4" w15:restartNumberingAfterBreak="0">
+    <w:nsid w:val="4F2F148D"/>
+    <w:multiLevelType w:val="hybridMultilevel"/>
+    <w:tmpl w:val="A3A2FD16"/>
+    <w:lvl w:ilvl="0" w:tplc="FFFFFFFF">
+      <w:start w:val="1"/>
+      <w:numFmt w:val="decimal"/>
+      <w:lvlText w:val="%1."/>
+      <w:lvlJc w:val="left"/>
+      <w:pPr>
+        <w:ind w:left="720" w:hanging="360"/>
+      </w:pPr>
+      <w:rPr>
+        <w:rFonts w:hint="default"/>
+      </w:rPr>
+    </w:lvl>
+    <w:lvl w:ilvl="1" w:tplc="FFFFFFFF" w:tentative="1">
+      <w:start w:val="1"/>
+      <w:numFmt w:val="lowerLetter"/>
+      <w:lvlText w:val="%2."/>
+      <w:lvlJc w:val="left"/>
+      <w:pPr>
+        <w:ind w:left="1440" w:hanging="360"/>
+      </w:pPr>
+    </w:lvl>
+    <w:lvl w:ilvl="2" w:tplc="FFFFFFFF" w:tentative="1">
+      <w:start w:val="1"/>
+      <w:numFmt w:val="lowerRoman"/>
+      <w:lvlText w:val="%3."/>
+      <w:lvlJc w:val="right"/>
+      <w:pPr>
+        <w:ind w:left="2160" w:hanging="180"/>
+      </w:pPr>
+    </w:lvl>
+    <w:lvl w:ilvl="3" w:tplc="FFFFFFFF" w:tentative="1">
+      <w:start w:val="1"/>
+      <w:numFmt w:val="decimal"/>
+      <w:lvlText w:val="%4."/>
+      <w:lvlJc w:val="left"/>
+      <w:pPr>
+        <w:ind w:left="2880" w:hanging="360"/>
+      </w:pPr>
+    </w:lvl>
+    <w:lvl w:ilvl="4" w:tplc="FFFFFFFF" w:tentative="1">
+      <w:start w:val="1"/>
+      <w:numFmt w:val="lowerLetter"/>
+      <w:lvlText w:val="%5."/>
+      <w:lvlJc w:val="left"/>
+      <w:pPr>
+        <w:ind w:left="3600" w:hanging="360"/>
+      </w:pPr>
+    </w:lvl>
+    <w:lvl w:ilvl="5" w:tplc="FFFFFFFF" w:tentative="1">
+      <w:start w:val="1"/>
+      <w:numFmt w:val="lowerRoman"/>
+      <w:lvlText w:val="%6."/>
+      <w:lvlJc w:val="right"/>
+      <w:pPr>
+        <w:ind w:left="4320" w:hanging="180"/>
+      </w:pPr>
+    </w:lvl>
+    <w:lvl w:ilvl="6" w:tplc="FFFFFFFF" w:tentative="1">
+      <w:start w:val="1"/>
+      <w:numFmt w:val="decimal"/>
+      <w:lvlText w:val="%7."/>
+      <w:lvlJc w:val="left"/>
+      <w:pPr>
+        <w:ind w:left="5040" w:hanging="360"/>
+      </w:pPr>
+    </w:lvl>
+    <w:lvl w:ilvl="7" w:tplc="FFFFFFFF" w:tentative="1">
+      <w:start w:val="1"/>
+      <w:numFmt w:val="lowerLetter"/>
+      <w:lvlText w:val="%8."/>
+      <w:lvlJc w:val="left"/>
+      <w:pPr>
+        <w:ind w:left="5760" w:hanging="360"/>
+      </w:pPr>
+    </w:lvl>
+    <w:lvl w:ilvl="8" w:tplc="FFFFFFFF" w:tentative="1">
+      <w:start w:val="1"/>
+      <w:numFmt w:val="lowerRoman"/>
+      <w:lvlText w:val="%9."/>
+      <w:lvlJc w:val="right"/>
+      <w:pPr>
+        <w:ind w:left="6480" w:hanging="180"/>
+      </w:pPr>
+    </w:lvl>
+  </w:abstractNum>
+  <w:abstractNum w:abstractNumId="5" w15:restartNumberingAfterBreak="0">
+    <w:nsid w:val="50F04322"/>
+    <w:multiLevelType w:val="hybridMultilevel"/>
+    <w:tmpl w:val="47342756"/>
+    <w:lvl w:ilvl="0" w:tplc="0E620C60">
+      <w:numFmt w:val="bullet"/>
+      <w:lvlText w:val="-"/>
+      <w:lvlJc w:val="left"/>
+      <w:pPr>
+        <w:ind w:left="720" w:hanging="360"/>
+      </w:pPr>
+      <w:rPr>
+        <w:rFonts w:ascii="Aptos" w:eastAsiaTheme="minorHAnsi" w:hAnsi="Aptos" w:cstheme="minorBidi" w:hint="default"/>
+      </w:rPr>
+    </w:lvl>
+    <w:lvl w:ilvl="1" w:tplc="04090003" w:tentative="1">
+      <w:start w:val="1"/>
+      <w:numFmt w:val="bullet"/>
+      <w:lvlText w:val="o"/>
+      <w:lvlJc w:val="left"/>
+      <w:pPr>
+        <w:ind w:left="1440" w:hanging="360"/>
+      </w:pPr>
+      <w:rPr>
+        <w:rFonts w:ascii="Courier New" w:hAnsi="Courier New" w:cs="Courier New" w:hint="default"/>
+      </w:rPr>
+    </w:lvl>
+    <w:lvl w:ilvl="2" w:tplc="04090005" w:tentative="1">
+      <w:start w:val="1"/>
+      <w:numFmt w:val="bullet"/>
+      <w:lvlText w:val=""/>
+      <w:lvlJc w:val="left"/>
+      <w:pPr>
+        <w:ind w:left="2160" w:hanging="360"/>
+      </w:pPr>
+      <w:rPr>
+        <w:rFonts w:ascii="Wingdings" w:hAnsi="Wingdings" w:hint="default"/>
+      </w:rPr>
+    </w:lvl>
+    <w:lvl w:ilvl="3" w:tplc="04090001" w:tentative="1">
+      <w:start w:val="1"/>
+      <w:numFmt w:val="bullet"/>
+      <w:lvlText w:val=""/>
+      <w:lvlJc w:val="left"/>
+      <w:pPr>
+        <w:ind w:left="2880" w:hanging="360"/>
+      </w:pPr>
+      <w:rPr>
+        <w:rFonts w:ascii="Symbol" w:hAnsi="Symbol" w:hint="default"/>
+      </w:rPr>
+    </w:lvl>
+    <w:lvl w:ilvl="4" w:tplc="04090003" w:tentative="1">
+      <w:start w:val="1"/>
+      <w:numFmt w:val="bullet"/>
+      <w:lvlText w:val="o"/>
+      <w:lvlJc w:val="left"/>
+      <w:pPr>
+        <w:ind w:left="3600" w:hanging="360"/>
+      </w:pPr>
+      <w:rPr>
+        <w:rFonts w:ascii="Courier New" w:hAnsi="Courier New" w:cs="Courier New" w:hint="default"/>
+      </w:rPr>
+    </w:lvl>
+    <w:lvl w:ilvl="5" w:tplc="04090005" w:tentative="1">
+      <w:start w:val="1"/>
+      <w:numFmt w:val="bullet"/>
+      <w:lvlText w:val=""/>
+      <w:lvlJc w:val="left"/>
+      <w:pPr>
+        <w:ind w:left="4320" w:hanging="360"/>
+      </w:pPr>
+      <w:rPr>
+        <w:rFonts w:ascii="Wingdings" w:hAnsi="Wingdings" w:hint="default"/>
+      </w:rPr>
+    </w:lvl>
+    <w:lvl w:ilvl="6" w:tplc="04090001" w:tentative="1">
+      <w:start w:val="1"/>
+      <w:numFmt w:val="bullet"/>
+      <w:lvlText w:val=""/>
+      <w:lvlJc w:val="left"/>
+      <w:pPr>
+        <w:ind w:left="5040" w:hanging="360"/>
+      </w:pPr>
+      <w:rPr>
+        <w:rFonts w:ascii="Symbol" w:hAnsi="Symbol" w:hint="default"/>
+      </w:rPr>
+    </w:lvl>
+    <w:lvl w:ilvl="7" w:tplc="04090003" w:tentative="1">
+      <w:start w:val="1"/>
+      <w:numFmt w:val="bullet"/>
+      <w:lvlText w:val="o"/>
+      <w:lvlJc w:val="left"/>
+      <w:pPr>
+        <w:ind w:left="5760" w:hanging="360"/>
+      </w:pPr>
+      <w:rPr>
+        <w:rFonts w:ascii="Courier New" w:hAnsi="Courier New" w:cs="Courier New" w:hint="default"/>
+      </w:rPr>
+    </w:lvl>
+    <w:lvl w:ilvl="8" w:tplc="04090005" w:tentative="1">
+      <w:start w:val="1"/>
+      <w:numFmt w:val="bullet"/>
+      <w:lvlText w:val=""/>
+      <w:lvlJc w:val="left"/>
+      <w:pPr>
+        <w:ind w:left="6480" w:hanging="360"/>
+      </w:pPr>
+      <w:rPr>
+        <w:rFonts w:ascii="Wingdings" w:hAnsi="Wingdings" w:hint="default"/>
+      </w:rPr>
+    </w:lvl>
+  </w:abstractNum>
+  <w:abstractNum w:abstractNumId="6" w15:restartNumberingAfterBreak="0">
+    <w:nsid w:val="6666190B"/>
+    <w:multiLevelType w:val="hybridMultilevel"/>
+    <w:tmpl w:val="00BEB7BC"/>
+    <w:lvl w:ilvl="0" w:tplc="0E620C60">
+      <w:numFmt w:val="bullet"/>
+      <w:lvlText w:val="-"/>
+      <w:lvlJc w:val="left"/>
+      <w:pPr>
+        <w:ind w:left="720" w:hanging="360"/>
+      </w:pPr>
+      <w:rPr>
+        <w:rFonts w:ascii="Aptos" w:eastAsiaTheme="minorHAnsi" w:hAnsi="Aptos" w:cstheme="minorBidi" w:hint="default"/>
+      </w:rPr>
+    </w:lvl>
+    <w:lvl w:ilvl="1" w:tplc="04090003" w:tentative="1">
+      <w:start w:val="1"/>
+      <w:numFmt w:val="bullet"/>
+      <w:lvlText w:val="o"/>
+      <w:lvlJc w:val="left"/>
+      <w:pPr>
+        <w:ind w:left="1440" w:hanging="360"/>
+      </w:pPr>
+      <w:rPr>
+        <w:rFonts w:ascii="Courier New" w:hAnsi="Courier New" w:cs="Courier New" w:hint="default"/>
+      </w:rPr>
+    </w:lvl>
+    <w:lvl w:ilvl="2" w:tplc="04090005" w:tentative="1">
+      <w:start w:val="1"/>
+      <w:numFmt w:val="bullet"/>
+      <w:lvlText w:val=""/>
+      <w:lvlJc w:val="left"/>
+      <w:pPr>
+        <w:ind w:left="2160" w:hanging="360"/>
+      </w:pPr>
+      <w:rPr>
+        <w:rFonts w:ascii="Wingdings" w:hAnsi="Wingdings" w:hint="default"/>
+      </w:rPr>
+    </w:lvl>
+    <w:lvl w:ilvl="3" w:tplc="04090001" w:tentative="1">
+      <w:start w:val="1"/>
+      <w:numFmt w:val="bullet"/>
+      <w:lvlText w:val=""/>
+      <w:lvlJc w:val="left"/>
+      <w:pPr>
+        <w:ind w:left="2880" w:hanging="360"/>
+      </w:pPr>
+      <w:rPr>
+        <w:rFonts w:ascii="Symbol" w:hAnsi="Symbol" w:hint="default"/>
+      </w:rPr>
+    </w:lvl>
+    <w:lvl w:ilvl="4" w:tplc="04090003" w:tentative="1">
+      <w:start w:val="1"/>
+      <w:numFmt w:val="bullet"/>
+      <w:lvlText w:val="o"/>
+      <w:lvlJc w:val="left"/>
+      <w:pPr>
+        <w:ind w:left="3600" w:hanging="360"/>
+      </w:pPr>
+      <w:rPr>
+        <w:rFonts w:ascii="Courier New" w:hAnsi="Courier New" w:cs="Courier New" w:hint="default"/>
+      </w:rPr>
+    </w:lvl>
+    <w:lvl w:ilvl="5" w:tplc="04090005" w:tentative="1">
+      <w:start w:val="1"/>
+      <w:numFmt w:val="bullet"/>
+      <w:lvlText w:val=""/>
+      <w:lvlJc w:val="left"/>
+      <w:pPr>
+        <w:ind w:left="4320" w:hanging="360"/>
+      </w:pPr>
+      <w:rPr>
+        <w:rFonts w:ascii="Wingdings" w:hAnsi="Wingdings" w:hint="default"/>
+      </w:rPr>
+    </w:lvl>
+    <w:lvl w:ilvl="6" w:tplc="04090001" w:tentative="1">
+      <w:start w:val="1"/>
+      <w:numFmt w:val="bullet"/>
+      <w:lvlText w:val=""/>
+      <w:lvlJc w:val="left"/>
+      <w:pPr>
+        <w:ind w:left="5040" w:hanging="360"/>
+      </w:pPr>
+      <w:rPr>
+        <w:rFonts w:ascii="Symbol" w:hAnsi="Symbol" w:hint="default"/>
+      </w:rPr>
+    </w:lvl>
+    <w:lvl w:ilvl="7" w:tplc="04090003" w:tentative="1">
+      <w:start w:val="1"/>
+      <w:numFmt w:val="bullet"/>
+      <w:lvlText w:val="o"/>
+      <w:lvlJc w:val="left"/>
+      <w:pPr>
+        <w:ind w:left="5760" w:hanging="360"/>
+      </w:pPr>
+      <w:rPr>
+        <w:rFonts w:ascii="Courier New" w:hAnsi="Courier New" w:cs="Courier New" w:hint="default"/>
+      </w:rPr>
+    </w:lvl>
+    <w:lvl w:ilvl="8" w:tplc="04090005" w:tentative="1">
+      <w:start w:val="1"/>
+      <w:numFmt w:val="bullet"/>
+      <w:lvlText w:val=""/>
+      <w:lvlJc w:val="left"/>
+      <w:pPr>
+        <w:ind w:left="6480" w:hanging="360"/>
+      </w:pPr>
+      <w:rPr>
+        <w:rFonts w:ascii="Wingdings" w:hAnsi="Wingdings" w:hint="default"/>
+      </w:rPr>
+    </w:lvl>
+  </w:abstractNum>
+  <w:abstractNum w:abstractNumId="7" w15:restartNumberingAfterBreak="0">
     <w:nsid w:val="6F527186"/>
     <w:multiLevelType w:val="hybridMultilevel"/>
     <w:tmpl w:val="A3A2FD16"/>
@@ -428,7 +1479,7 @@
     </w:lvl>
   </w:abstractNum>
   <w:num w:numId="1" w16cid:durableId="1910994510">
-    <w:abstractNumId w:val="1"/>
+    <w:abstractNumId w:val="7"/>
   </w:num>
   <w:num w:numId="2" w16cid:durableId="7678369">
     <w:abstractNumId w:val="0"/>
@@ -459,6 +1510,27 @@
     <w:lvlOverride w:ilvl="8">
       <w:startOverride w:val="1"/>
     </w:lvlOverride>
+  </w:num>
+  <w:num w:numId="3" w16cid:durableId="1386837843">
+    <w:abstractNumId w:val="5"/>
+  </w:num>
+  <w:num w:numId="4" w16cid:durableId="1838307557">
+    <w:abstractNumId w:val="0"/>
+  </w:num>
+  <w:num w:numId="5" w16cid:durableId="409935184">
+    <w:abstractNumId w:val="3"/>
+  </w:num>
+  <w:num w:numId="6" w16cid:durableId="2129347324">
+    <w:abstractNumId w:val="1"/>
+  </w:num>
+  <w:num w:numId="7" w16cid:durableId="743843811">
+    <w:abstractNumId w:val="4"/>
+  </w:num>
+  <w:num w:numId="8" w16cid:durableId="872305907">
+    <w:abstractNumId w:val="2"/>
+  </w:num>
+  <w:num w:numId="9" w16cid:durableId="54091811">
+    <w:abstractNumId w:val="6"/>
   </w:num>
 </w:numbering>
 </file>
@@ -863,6 +1935,7 @@
   <w:style w:type="paragraph" w:default="1" w:styleId="Normal">
     <w:name w:val="Normal"/>
     <w:qFormat/>
+    <w:rsid w:val="00502586"/>
   </w:style>
   <w:style w:type="paragraph" w:styleId="Heading1">
     <w:name w:val="heading 1"/>

</xml_diff>